<commit_message>
fix: support inline formulas in table notes
</commit_message>
<xml_diff>
--- a/examples/汽车、摩托车用车速表.docx
+++ b/examples/汽车、摩托车用车速表.docx
@@ -2065,7 +2065,47 @@
             </w:pPr>
             <w:r/>
             <w:r>
-              <w:t>对于指针式车速表，80%v_{\text{max}}计算值若不在分度线上，向上取临近的分度线车速值；若该值超过v_{\text{max}}，则向下取临近的分度线车速值。</w:t>
+              <w:t>对于指针式车速表，80%</w:t>
+            </w:r>
+            <m:oMath>
+              <m:sSub>
+                <m:e>
+                  <m:r>
+                    <m:t>v</m:t>
+                  </m:r>
+                </m:e>
+                <m:sub>
+                  <m:r>
+                    <m:rPr>
+                      <m:nor/>
+                    </m:rPr>
+                    <m:t>max</m:t>
+                  </m:r>
+                </m:sub>
+              </m:sSub>
+            </m:oMath>
+            <w:r>
+              <w:t>计算值若不在分度线上，向上取临近的分度线车速值；若该值超过</w:t>
+            </w:r>
+            <m:oMath>
+              <m:sSub>
+                <m:e>
+                  <m:r>
+                    <m:t>v</m:t>
+                  </m:r>
+                </m:e>
+                <m:sub>
+                  <m:r>
+                    <m:rPr>
+                      <m:nor/>
+                    </m:rPr>
+                    <m:t>max</m:t>
+                  </m:r>
+                </m:sub>
+              </m:sSub>
+            </m:oMath>
+            <w:r>
+              <w:t>，则向下取临近的分度线车速值。</w:t>
             </w:r>
           </w:p>
         </w:tc>

</xml_diff>